<commit_message>
Implement database connection and customer creation module
</commit_message>
<xml_diff>
--- a/Development Plan.docx
+++ b/Development Plan.docx
@@ -43,8 +43,14 @@
           <w:ilvl w:val="0"/>
           <w:numId w:val="1"/>
         </w:numPr>
-      </w:pPr>
-      <w:r>
+        <w:rPr>
+          <w:strike/>
+        </w:rPr>
+      </w:pPr>
+      <w:r>
+        <w:rPr>
+          <w:strike/>
+        </w:rPr>
         <w:t xml:space="preserve">Create folder structure </w:t>
       </w:r>
     </w:p>
@@ -54,8 +60,14 @@
           <w:ilvl w:val="0"/>
           <w:numId w:val="1"/>
         </w:numPr>
-      </w:pPr>
-      <w:r>
+        <w:rPr>
+          <w:strike/>
+        </w:rPr>
+      </w:pPr>
+      <w:r>
+        <w:rPr>
+          <w:strike/>
+        </w:rPr>
         <w:t xml:space="preserve">Create virtual environment </w:t>
       </w:r>
     </w:p>
@@ -65,8 +77,14 @@
           <w:ilvl w:val="0"/>
           <w:numId w:val="1"/>
         </w:numPr>
-      </w:pPr>
-      <w:r>
+        <w:rPr>
+          <w:strike/>
+        </w:rPr>
+      </w:pPr>
+      <w:r>
+        <w:rPr>
+          <w:strike/>
+        </w:rPr>
         <w:t xml:space="preserve">Install MySQL connector </w:t>
       </w:r>
     </w:p>
@@ -76,8 +94,14 @@
           <w:ilvl w:val="0"/>
           <w:numId w:val="1"/>
         </w:numPr>
-      </w:pPr>
-      <w:r>
+        <w:rPr>
+          <w:strike/>
+        </w:rPr>
+      </w:pPr>
+      <w:r>
+        <w:rPr>
+          <w:strike/>
+        </w:rPr>
         <w:t xml:space="preserve">Initialize Git repository </w:t>
       </w:r>
     </w:p>
@@ -102,8 +126,14 @@
           <w:ilvl w:val="0"/>
           <w:numId w:val="2"/>
         </w:numPr>
-      </w:pPr>
-      <w:r>
+        <w:rPr>
+          <w:strike/>
+        </w:rPr>
+      </w:pPr>
+      <w:r>
+        <w:rPr>
+          <w:strike/>
+        </w:rPr>
         <w:t xml:space="preserve">Create database </w:t>
       </w:r>
     </w:p>
@@ -113,8 +143,14 @@
           <w:ilvl w:val="0"/>
           <w:numId w:val="2"/>
         </w:numPr>
-      </w:pPr>
-      <w:r>
+        <w:rPr>
+          <w:strike/>
+        </w:rPr>
+      </w:pPr>
+      <w:r>
+        <w:rPr>
+          <w:strike/>
+        </w:rPr>
         <w:t xml:space="preserve">Create tables </w:t>
       </w:r>
     </w:p>
@@ -124,8 +160,14 @@
           <w:ilvl w:val="0"/>
           <w:numId w:val="2"/>
         </w:numPr>
-      </w:pPr>
-      <w:r>
+        <w:rPr>
+          <w:strike/>
+        </w:rPr>
+      </w:pPr>
+      <w:r>
+        <w:rPr>
+          <w:strike/>
+        </w:rPr>
         <w:t xml:space="preserve">Add foreign keys </w:t>
       </w:r>
     </w:p>
@@ -135,8 +177,14 @@
           <w:ilvl w:val="0"/>
           <w:numId w:val="2"/>
         </w:numPr>
-      </w:pPr>
-      <w:r>
+        <w:rPr>
+          <w:strike/>
+        </w:rPr>
+      </w:pPr>
+      <w:r>
+        <w:rPr>
+          <w:strike/>
+        </w:rPr>
         <w:t xml:space="preserve">Insert sample data </w:t>
       </w:r>
     </w:p>
@@ -161,8 +209,14 @@
           <w:ilvl w:val="0"/>
           <w:numId w:val="3"/>
         </w:numPr>
-      </w:pPr>
-      <w:r>
+        <w:rPr>
+          <w:strike/>
+        </w:rPr>
+      </w:pPr>
+      <w:r>
+        <w:rPr>
+          <w:strike/>
+        </w:rPr>
         <w:t xml:space="preserve">Connection module </w:t>
       </w:r>
     </w:p>
@@ -172,8 +226,14 @@
           <w:ilvl w:val="0"/>
           <w:numId w:val="3"/>
         </w:numPr>
-      </w:pPr>
-      <w:r>
+        <w:rPr>
+          <w:strike/>
+        </w:rPr>
+      </w:pPr>
+      <w:r>
+        <w:rPr>
+          <w:strike/>
+        </w:rPr>
         <w:t xml:space="preserve">Configuration </w:t>
       </w:r>
     </w:p>
@@ -183,8 +243,14 @@
           <w:ilvl w:val="0"/>
           <w:numId w:val="3"/>
         </w:numPr>
-      </w:pPr>
-      <w:r>
+        <w:rPr>
+          <w:strike/>
+        </w:rPr>
+      </w:pPr>
+      <w:r>
+        <w:rPr>
+          <w:strike/>
+        </w:rPr>
         <w:t xml:space="preserve">Test connection </w:t>
       </w:r>
     </w:p>
@@ -2729,6 +2795,7 @@
   <w:style w:type="character" w:default="1" w:styleId="DefaultParagraphFont">
     <w:name w:val="Default Paragraph Font"/>
     <w:uiPriority w:val="1"/>
+    <w:semiHidden/>
     <w:unhideWhenUsed/>
   </w:style>
   <w:style w:type="table" w:default="1" w:styleId="TableNormal">

</xml_diff>